<commit_message>
Deploying to gh-pages from @ Morrison-Lab/psw@6c76dbed21f538572aa55da47ef06df633f5ce0c 🚀
</commit_message>
<xml_diff>
--- a/chapters/citations-evidence.docx
+++ b/chapters/citations-evidence.docx
@@ -15,7 +15,7 @@
         <w:pStyle w:val="Date"/>
       </w:pPr>
       <w:r>
-        <w:t xml:space="preserve">Last modified: 2026-08-10 03:56:09 (UTC)</w:t>
+        <w:t xml:space="preserve">Last modified: 2026-08-10 05:31:03 (UTC)</w:t>
       </w:r>
     </w:p>
     <w:p>
@@ -471,13 +471,13 @@
     </w:p>
     <w:bookmarkEnd w:id="13"/>
     <w:bookmarkEnd w:id="14"/>
-    <w:bookmarkStart w:id="15" w:name="what-makes-a-citation-relevant"/>
+    <w:bookmarkStart w:id="18" w:name="do-not-substitute-flippancy-for-support"/>
     <w:p>
       <w:pPr>
         <w:pStyle w:val="Heading2"/>
       </w:pPr>
       <w:r>
-        <w:t xml:space="preserve">3 What makes a citation relevant</w:t>
+        <w:t xml:space="preserve">3 Do not substitute flippancy for support</w:t>
       </w:r>
     </w:p>
     <w:p>
@@ -485,6 +485,1141 @@
         <w:pStyle w:val="FirstParagraph"/>
       </w:pPr>
       <w:r>
+        <w:t xml:space="preserve">Some phrases assert that a claim needs no support</w:t>
+      </w:r>
+      <w:r>
+        <w:t xml:space="preserve"> </w:t>
+      </w:r>
+      <w:r>
+        <w:t xml:space="preserve">instead of supplying any:</w:t>
+      </w:r>
+    </w:p>
+    <w:p>
+      <w:pPr>
+        <w:pStyle w:val="Compact"/>
+        <w:numPr>
+          <w:ilvl w:val="0"/>
+          <w:numId w:val="1005"/>
+        </w:numPr>
+      </w:pPr>
+      <w:r>
+        <w:t xml:space="preserve">“it is obvious that”</w:t>
+      </w:r>
+    </w:p>
+    <w:p>
+      <w:pPr>
+        <w:pStyle w:val="Compact"/>
+        <w:numPr>
+          <w:ilvl w:val="0"/>
+          <w:numId w:val="1005"/>
+        </w:numPr>
+      </w:pPr>
+      <w:r>
+        <w:t xml:space="preserve">“clearly, it follows that”</w:t>
+      </w:r>
+    </w:p>
+    <w:p>
+      <w:pPr>
+        <w:pStyle w:val="Compact"/>
+        <w:numPr>
+          <w:ilvl w:val="0"/>
+          <w:numId w:val="1005"/>
+        </w:numPr>
+      </w:pPr>
+      <w:r>
+        <w:t xml:space="preserve">“it should be familiar to you that”</w:t>
+      </w:r>
+    </w:p>
+    <w:p>
+      <w:pPr>
+        <w:pStyle w:val="Compact"/>
+        <w:numPr>
+          <w:ilvl w:val="0"/>
+          <w:numId w:val="1005"/>
+        </w:numPr>
+      </w:pPr>
+      <w:r>
+        <w:t xml:space="preserve">“the familiar formula”</w:t>
+      </w:r>
+    </w:p>
+    <w:p>
+      <w:pPr>
+        <w:pStyle w:val="Compact"/>
+        <w:numPr>
+          <w:ilvl w:val="0"/>
+          <w:numId w:val="1005"/>
+        </w:numPr>
+      </w:pPr>
+      <w:r>
+        <w:t xml:space="preserve">“of course”</w:t>
+      </w:r>
+    </w:p>
+    <w:p>
+      <w:pPr>
+        <w:pStyle w:val="Compact"/>
+        <w:numPr>
+          <w:ilvl w:val="0"/>
+          <w:numId w:val="1005"/>
+        </w:numPr>
+      </w:pPr>
+      <w:r>
+        <w:t xml:space="preserve">“as everyone knows”</w:t>
+      </w:r>
+    </w:p>
+    <w:p>
+      <w:pPr>
+        <w:pStyle w:val="FirstParagraph"/>
+      </w:pPr>
+      <w:r>
+        <w:t xml:space="preserve">The problem is the appeal, not the individual words.</w:t>
+      </w:r>
+      <w:r>
+        <w:t xml:space="preserve"> </w:t>
+      </w:r>
+      <w:r>
+        <w:t xml:space="preserve">“Clearly”</w:t>
+      </w:r>
+      <w:r>
+        <w:t xml:space="preserve"> </w:t>
+      </w:r>
+      <w:r>
+        <w:t xml:space="preserve">is fine as an adverb of manner</w:t>
+      </w:r>
+      <w:r>
+        <w:t xml:space="preserve"> </w:t>
+      </w:r>
+      <w:r>
+        <w:t xml:space="preserve">(</w:t>
+      </w:r>
+      <w:r>
+        <w:t xml:space="preserve">“the methods section clearly describes the sampling frame”</w:t>
+      </w:r>
+      <w:r>
+        <w:t xml:space="preserve">),</w:t>
+      </w:r>
+      <w:r>
+        <w:t xml:space="preserve"> </w:t>
+      </w:r>
+      <w:r>
+        <w:t xml:space="preserve">and</w:t>
+      </w:r>
+      <w:r>
+        <w:t xml:space="preserve"> </w:t>
+      </w:r>
+      <w:r>
+        <w:t xml:space="preserve">“of course”</w:t>
+      </w:r>
+      <w:r>
+        <w:t xml:space="preserve"> </w:t>
+      </w:r>
+      <w:r>
+        <w:t xml:space="preserve">is fine when it flags an assumption</w:t>
+      </w:r>
+      <w:r>
+        <w:t xml:space="preserve"> </w:t>
+      </w:r>
+      <w:r>
+        <w:t xml:space="preserve">you have already established.</w:t>
+      </w:r>
+      <w:r>
+        <w:t xml:space="preserve"> </w:t>
+      </w:r>
+      <w:r>
+        <w:t xml:space="preserve">Each becomes a problem only when it stands in</w:t>
+      </w:r>
+      <w:r>
+        <w:t xml:space="preserve"> </w:t>
+      </w:r>
+      <w:r>
+        <w:t xml:space="preserve">for an argument you have not made.</w:t>
+      </w:r>
+    </w:p>
+    <w:p>
+      <w:pPr>
+        <w:pStyle w:val="BodyText"/>
+      </w:pPr>
+      <w:r>
+        <w:t xml:space="preserve">These phrases do no work for the reader.</w:t>
+      </w:r>
+      <w:r>
+        <w:t xml:space="preserve"> </w:t>
+      </w:r>
+      <w:r>
+        <w:t xml:space="preserve">A reader who already knows the result gains nothing</w:t>
+      </w:r>
+      <w:r>
+        <w:t xml:space="preserve"> </w:t>
+      </w:r>
+      <w:r>
+        <w:t xml:space="preserve">from being told that it is familiar,</w:t>
+      </w:r>
+      <w:r>
+        <w:t xml:space="preserve"> </w:t>
+      </w:r>
+      <w:r>
+        <w:t xml:space="preserve">and a reader who does not</w:t>
+      </w:r>
+      <w:r>
+        <w:t xml:space="preserve"> </w:t>
+      </w:r>
+      <w:r>
+        <w:t xml:space="preserve">is told that the gap is their own fault,</w:t>
+      </w:r>
+      <w:r>
+        <w:t xml:space="preserve"> </w:t>
+      </w:r>
+      <w:r>
+        <w:t xml:space="preserve">without being given any way to close it.</w:t>
+      </w:r>
+      <w:r>
+        <w:t xml:space="preserve"> </w:t>
+      </w:r>
+      <w:r>
+        <w:t xml:space="preserve">They also cost the writer something.</w:t>
+      </w:r>
+      <w:r>
+        <w:t xml:space="preserve"> </w:t>
+      </w:r>
+      <w:r>
+        <w:t xml:space="preserve">Working a step out is how you find out whether it holds;</w:t>
+      </w:r>
+      <w:r>
+        <w:t xml:space="preserve"> </w:t>
+      </w:r>
+      <w:r>
+        <w:t xml:space="preserve">calling it obvious settles the question by assertion,</w:t>
+      </w:r>
+      <w:r>
+        <w:t xml:space="preserve"> </w:t>
+      </w:r>
+      <w:r>
+        <w:t xml:space="preserve">and leaves any error in the step where it is.</w:t>
+      </w:r>
+      <w:r>
+        <w:t xml:space="preserve"> </w:t>
+      </w:r>
+      <w:r>
+        <w:t xml:space="preserve">So if you cannot supply a derivation or a citation for a step,</w:t>
+      </w:r>
+      <w:r>
+        <w:t xml:space="preserve"> </w:t>
+      </w:r>
+      <w:r>
+        <w:t xml:space="preserve">treat that as a reason to work the step out,</w:t>
+      </w:r>
+      <w:r>
+        <w:t xml:space="preserve"> </w:t>
+      </w:r>
+      <w:r>
+        <w:t xml:space="preserve">not as a reason to call it obvious.</w:t>
+      </w:r>
+    </w:p>
+    <w:p>
+      <w:pPr>
+        <w:pStyle w:val="BodyText"/>
+      </w:pPr>
+      <w:r>
+        <w:t xml:space="preserve">Replace such phrases with one of the following:</w:t>
+      </w:r>
+    </w:p>
+    <w:p>
+      <w:pPr>
+        <w:pStyle w:val="Compact"/>
+        <w:numPr>
+          <w:ilvl w:val="0"/>
+          <w:numId w:val="1006"/>
+        </w:numPr>
+      </w:pPr>
+      <w:r>
+        <w:rPr>
+          <w:b/>
+          <w:bCs/>
+        </w:rPr>
+        <w:t xml:space="preserve">A direct derivation.</w:t>
+      </w:r>
+      <w:r>
+        <w:t xml:space="preserve"> </w:t>
+      </w:r>
+      <w:r>
+        <w:t xml:space="preserve">Show the intermediate steps,</w:t>
+      </w:r>
+      <w:r>
+        <w:t xml:space="preserve"> </w:t>
+      </w:r>
+      <w:r>
+        <w:t xml:space="preserve">or state which identity or algebraic manipulation takes you from one line to the next.</w:t>
+      </w:r>
+    </w:p>
+    <w:p>
+      <w:pPr>
+        <w:pStyle w:val="Compact"/>
+        <w:numPr>
+          <w:ilvl w:val="0"/>
+          <w:numId w:val="1006"/>
+        </w:numPr>
+      </w:pPr>
+      <w:r>
+        <w:rPr>
+          <w:b/>
+          <w:bCs/>
+        </w:rPr>
+        <w:t xml:space="preserve">A specific citation.</w:t>
+      </w:r>
+      <w:r>
+        <w:t xml:space="preserve"> </w:t>
+      </w:r>
+      <w:r>
+        <w:t xml:space="preserve">Name the source that establishes the result,</w:t>
+      </w:r>
+      <w:r>
+        <w:t xml:space="preserve"> </w:t>
+      </w:r>
+      <w:r>
+        <w:t xml:space="preserve">and give a chapter, section, page, or equation number</w:t>
+      </w:r>
+      <w:r>
+        <w:t xml:space="preserve"> </w:t>
+      </w:r>
+      <w:r>
+        <w:t xml:space="preserve">whenever the source is long enough</w:t>
+      </w:r>
+      <w:r>
+        <w:t xml:space="preserve"> </w:t>
+      </w:r>
+      <w:r>
+        <w:t xml:space="preserve">that a bare citation would leave the reader searching.</w:t>
+      </w:r>
+    </w:p>
+    <w:p>
+      <w:pPr>
+        <w:pStyle w:val="Compact"/>
+        <w:numPr>
+          <w:ilvl w:val="0"/>
+          <w:numId w:val="1006"/>
+        </w:numPr>
+      </w:pPr>
+      <w:r>
+        <w:rPr>
+          <w:b/>
+          <w:bCs/>
+        </w:rPr>
+        <w:t xml:space="preserve">A cross-reference.</w:t>
+      </w:r>
+      <w:r>
+        <w:t xml:space="preserve"> </w:t>
+      </w:r>
+      <w:r>
+        <w:t xml:space="preserve">When you established the result earlier in the same document,</w:t>
+      </w:r>
+      <w:r>
+        <w:t xml:space="preserve"> </w:t>
+      </w:r>
+      <w:r>
+        <w:t xml:space="preserve">point to it by number</w:t>
+      </w:r>
+      <w:r>
+        <w:t xml:space="preserve"> </w:t>
+      </w:r>
+      <w:r>
+        <w:t xml:space="preserve">(see</w:t>
+      </w:r>
+      <w:r>
+        <w:t xml:space="preserve"> </w:t>
+      </w:r>
+      <w:hyperlink r:id="rId15">
+        <w:r>
+          <w:rPr>
+            <w:rStyle w:val="Hyperlink"/>
+          </w:rPr>
+          <w:t xml:space="preserve">Defining terms clearly</w:t>
+        </w:r>
+      </w:hyperlink>
+      <w:r>
+        <w:t xml:space="preserve"> </w:t>
+      </w:r>
+      <w:r>
+        <w:t xml:space="preserve">for the Quarto cross-reference syntax).</w:t>
+      </w:r>
+    </w:p>
+    <w:p>
+      <w:pPr>
+        <w:pStyle w:val="FirstParagraph"/>
+      </w:pPr>
+      <w:r>
+        <w:t xml:space="preserve">Deleting the phrase and keeping the claim</w:t>
+      </w:r>
+      <w:r>
+        <w:t xml:space="preserve"> </w:t>
+      </w:r>
+      <w:r>
+        <w:t xml:space="preserve">is also usually an improvement:</w:t>
+      </w:r>
+      <w:r>
+        <w:t xml:space="preserve"> </w:t>
+      </w:r>
+      <w:r>
+        <w:t xml:space="preserve">“the log-likelihood is a sum of three terms”</w:t>
+      </w:r>
+      <w:r>
+        <w:t xml:space="preserve"> </w:t>
+      </w:r>
+      <w:r>
+        <w:t xml:space="preserve">makes the same claim about the log-likelihood as</w:t>
+      </w:r>
+      <w:r>
+        <w:t xml:space="preserve"> </w:t>
+      </w:r>
+      <w:r>
+        <w:t xml:space="preserve">“the log-likelihood is obviously a sum of three terms”</w:t>
+      </w:r>
+      <w:r>
+        <w:t xml:space="preserve">,</w:t>
+      </w:r>
+      <w:r>
+        <w:t xml:space="preserve"> </w:t>
+      </w:r>
+      <w:r>
+        <w:t xml:space="preserve">and it invites the reader to check the claim</w:t>
+      </w:r>
+      <w:r>
+        <w:t xml:space="preserve"> </w:t>
+      </w:r>
+      <w:r>
+        <w:t xml:space="preserve">rather than to defer to it.</w:t>
+      </w:r>
+    </w:p>
+    <w:bookmarkStart w:id="16" w:name="exm-flippant-derivation"/>
+    <w:p>
+      <w:pPr>
+        <w:pStyle w:val="BodyText"/>
+      </w:pPr>
+      <w:r>
+        <w:rPr>
+          <w:b/>
+          <w:bCs/>
+        </w:rPr>
+        <w:t xml:space="preserve">Example 1 (Replacing an appeal to familiarity)</w:t>
+      </w:r>
+      <w:r>
+        <w:t xml:space="preserve"> </w:t>
+      </w:r>
+      <w:r>
+        <w:t xml:space="preserve"> </w:t>
+      </w:r>
+    </w:p>
+    <w:p>
+      <w:pPr>
+        <w:pStyle w:val="BlockText"/>
+      </w:pPr>
+      <w:r>
+        <w:t xml:space="preserve">❌ Substituting the normal density into the likelihood</w:t>
+      </w:r>
+      <w:r>
+        <w:t xml:space="preserve"> </w:t>
+      </w:r>
+      <w:r>
+        <w:t xml:space="preserve">gives the familiar three-term formula.</w:t>
+      </w:r>
+    </w:p>
+    <w:p>
+      <w:pPr>
+        <w:pStyle w:val="BlockText"/>
+      </w:pPr>
+      <w:r>
+        <w:t xml:space="preserve">✅ For an independent sample</w:t>
+      </w:r>
+      <w:r>
+        <w:t xml:space="preserve"> </w:t>
+      </w:r>
+      <m:oMath>
+        <m:sSub>
+          <m:e>
+            <m:r>
+              <m:t>x</m:t>
+            </m:r>
+          </m:e>
+          <m:sub>
+            <m:r>
+              <m:t>1</m:t>
+            </m:r>
+          </m:sub>
+        </m:sSub>
+        <m:r>
+          <m:rPr>
+            <m:sty m:val="p"/>
+          </m:rPr>
+          <m:t>,</m:t>
+        </m:r>
+        <m:r>
+          <m:rPr>
+            <m:sty m:val="p"/>
+          </m:rPr>
+          <m:t>…</m:t>
+        </m:r>
+        <m:r>
+          <m:rPr>
+            <m:sty m:val="p"/>
+          </m:rPr>
+          <m:t>,</m:t>
+        </m:r>
+        <m:sSub>
+          <m:e>
+            <m:r>
+              <m:t>x</m:t>
+            </m:r>
+          </m:e>
+          <m:sub>
+            <m:r>
+              <m:t>n</m:t>
+            </m:r>
+          </m:sub>
+        </m:sSub>
+      </m:oMath>
+      <w:r>
+        <w:t xml:space="preserve"> </w:t>
+      </w:r>
+      <w:r>
+        <w:t xml:space="preserve">from a normal distribution with mean</w:t>
+      </w:r>
+      <w:r>
+        <w:t xml:space="preserve"> </w:t>
+      </w:r>
+      <m:oMath>
+        <m:r>
+          <m:t>μ</m:t>
+        </m:r>
+      </m:oMath>
+      <w:r>
+        <w:t xml:space="preserve"> </w:t>
+      </w:r>
+      <w:r>
+        <w:t xml:space="preserve">and variance</w:t>
+      </w:r>
+      <w:r>
+        <w:t xml:space="preserve"> </w:t>
+      </w:r>
+      <m:oMath>
+        <m:sSup>
+          <m:e>
+            <m:r>
+              <m:t>σ</m:t>
+            </m:r>
+          </m:e>
+          <m:sup>
+            <m:r>
+              <m:t>2</m:t>
+            </m:r>
+          </m:sup>
+        </m:sSup>
+      </m:oMath>
+      <w:r>
+        <w:t xml:space="preserve">,</w:t>
+      </w:r>
+      <w:r>
+        <w:t xml:space="preserve"> </w:t>
+      </w:r>
+      <w:r>
+        <w:t xml:space="preserve">substituting the normal density into the likelihood</w:t>
+      </w:r>
+      <w:r>
+        <w:t xml:space="preserve"> </w:t>
+      </w:r>
+      <w:r>
+        <w:t xml:space="preserve">and taking logarithms gives</w:t>
+      </w:r>
+    </w:p>
+    <w:p>
+      <w:pPr>
+        <w:pStyle w:val="BlockText"/>
+      </w:pPr>
+      <m:oMathPara>
+        <m:oMathParaPr>
+          <m:jc m:val="center"/>
+        </m:oMathParaPr>
+        <m:oMath>
+          <m:r>
+            <m:t>ℓ</m:t>
+          </m:r>
+          <m:r>
+            <m:rPr>
+              <m:sty m:val="p"/>
+            </m:rPr>
+            <m:t>(</m:t>
+          </m:r>
+          <m:r>
+            <m:t>μ</m:t>
+          </m:r>
+          <m:r>
+            <m:rPr>
+              <m:sty m:val="p"/>
+            </m:rPr>
+            <m:t>,</m:t>
+          </m:r>
+          <m:sSup>
+            <m:e>
+              <m:r>
+                <m:t>σ</m:t>
+              </m:r>
+            </m:e>
+            <m:sup>
+              <m:r>
+                <m:t>2</m:t>
+              </m:r>
+            </m:sup>
+          </m:sSup>
+          <m:r>
+            <m:rPr>
+              <m:sty m:val="p"/>
+            </m:rPr>
+            <m:t>)</m:t>
+          </m:r>
+          <m:r>
+            <m:rPr>
+              <m:sty m:val="p"/>
+            </m:rPr>
+            <m:t>=</m:t>
+          </m:r>
+          <m:r>
+            <m:rPr>
+              <m:sty m:val="p"/>
+            </m:rPr>
+            <m:t>−</m:t>
+          </m:r>
+          <m:f>
+            <m:fPr>
+              <m:type m:val="bar"/>
+            </m:fPr>
+            <m:num>
+              <m:r>
+                <m:t>n</m:t>
+              </m:r>
+            </m:num>
+            <m:den>
+              <m:r>
+                <m:t>2</m:t>
+              </m:r>
+            </m:den>
+          </m:f>
+          <m:r>
+            <m:rPr>
+              <m:sty m:val="p"/>
+            </m:rPr>
+            <m:t>log</m:t>
+          </m:r>
+          <m:r>
+            <m:rPr>
+              <m:sty m:val="p"/>
+            </m:rPr>
+            <m:t>(</m:t>
+          </m:r>
+          <m:r>
+            <m:t>2</m:t>
+          </m:r>
+          <m:r>
+            <m:t>π</m:t>
+          </m:r>
+          <m:r>
+            <m:rPr>
+              <m:sty m:val="p"/>
+            </m:rPr>
+            <m:t>)</m:t>
+          </m:r>
+          <m:r>
+            <m:rPr>
+              <m:sty m:val="p"/>
+            </m:rPr>
+            <m:t>−</m:t>
+          </m:r>
+          <m:f>
+            <m:fPr>
+              <m:type m:val="bar"/>
+            </m:fPr>
+            <m:num>
+              <m:r>
+                <m:t>n</m:t>
+              </m:r>
+            </m:num>
+            <m:den>
+              <m:r>
+                <m:t>2</m:t>
+              </m:r>
+            </m:den>
+          </m:f>
+          <m:r>
+            <m:rPr>
+              <m:sty m:val="p"/>
+            </m:rPr>
+            <m:t>log</m:t>
+          </m:r>
+          <m:d>
+            <m:dPr>
+              <m:begChr m:val="("/>
+              <m:sepChr m:val=""/>
+              <m:endChr m:val=")"/>
+              <m:grow/>
+            </m:dPr>
+            <m:e>
+              <m:sSup>
+                <m:e>
+                  <m:r>
+                    <m:t>σ</m:t>
+                  </m:r>
+                </m:e>
+                <m:sup>
+                  <m:r>
+                    <m:t>2</m:t>
+                  </m:r>
+                </m:sup>
+              </m:sSup>
+            </m:e>
+          </m:d>
+          <m:r>
+            <m:rPr>
+              <m:sty m:val="p"/>
+            </m:rPr>
+            <m:t>−</m:t>
+          </m:r>
+          <m:f>
+            <m:fPr>
+              <m:type m:val="bar"/>
+            </m:fPr>
+            <m:num>
+              <m:r>
+                <m:t>1</m:t>
+              </m:r>
+            </m:num>
+            <m:den>
+              <m:r>
+                <m:t>2</m:t>
+              </m:r>
+              <m:sSup>
+                <m:e>
+                  <m:r>
+                    <m:t>σ</m:t>
+                  </m:r>
+                </m:e>
+                <m:sup>
+                  <m:r>
+                    <m:t>2</m:t>
+                  </m:r>
+                </m:sup>
+              </m:sSup>
+            </m:den>
+          </m:f>
+          <m:nary>
+            <m:naryPr>
+              <m:chr m:val="∑"/>
+              <m:limLoc m:val="undOvr"/>
+              <m:subHide m:val="off"/>
+              <m:supHide m:val="off"/>
+            </m:naryPr>
+            <m:sub>
+              <m:r>
+                <m:t>i</m:t>
+              </m:r>
+              <m:r>
+                <m:rPr>
+                  <m:sty m:val="p"/>
+                </m:rPr>
+                <m:t>=</m:t>
+              </m:r>
+              <m:r>
+                <m:t>1</m:t>
+              </m:r>
+            </m:sub>
+            <m:sup>
+              <m:r>
+                <m:t>n</m:t>
+              </m:r>
+            </m:sup>
+            <m:e>
+              <m:sSup>
+                <m:e>
+                  <m:d>
+                    <m:dPr>
+                      <m:begChr m:val="("/>
+                      <m:sepChr m:val=""/>
+                      <m:endChr m:val=")"/>
+                      <m:grow/>
+                    </m:dPr>
+                    <m:e>
+                      <m:sSub>
+                        <m:e>
+                          <m:r>
+                            <m:t>x</m:t>
+                          </m:r>
+                        </m:e>
+                        <m:sub>
+                          <m:r>
+                            <m:t>i</m:t>
+                          </m:r>
+                        </m:sub>
+                      </m:sSub>
+                      <m:r>
+                        <m:rPr>
+                          <m:sty m:val="p"/>
+                        </m:rPr>
+                        <m:t>−</m:t>
+                      </m:r>
+                      <m:r>
+                        <m:t>μ</m:t>
+                      </m:r>
+                    </m:e>
+                  </m:d>
+                </m:e>
+                <m:sup>
+                  <m:r>
+                    <m:t>2</m:t>
+                  </m:r>
+                </m:sup>
+              </m:sSup>
+            </m:e>
+          </m:nary>
+          <m:r>
+            <m:rPr>
+              <m:sty m:val="p"/>
+            </m:rPr>
+            <m:t>.</m:t>
+          </m:r>
+        </m:oMath>
+      </m:oMathPara>
+    </w:p>
+    <w:p>
+      <w:pPr>
+        <w:pStyle w:val="BlockText"/>
+      </w:pPr>
+      <w:r>
+        <w:t xml:space="preserve">The three terms are,</w:t>
+      </w:r>
+      <w:r>
+        <w:t xml:space="preserve"> </w:t>
+      </w:r>
+      <w:r>
+        <w:t xml:space="preserve">in order:</w:t>
+      </w:r>
+    </w:p>
+    <w:p>
+      <w:pPr>
+        <w:pStyle w:val="Compact"/>
+        <w:numPr>
+          <w:ilvl w:val="0"/>
+          <w:numId w:val="1007"/>
+        </w:numPr>
+      </w:pPr>
+      <w:r>
+        <w:t xml:space="preserve">a constant that does not involve the parameters;</w:t>
+      </w:r>
+    </w:p>
+    <w:p>
+      <w:pPr>
+        <w:pStyle w:val="Compact"/>
+        <w:numPr>
+          <w:ilvl w:val="0"/>
+          <w:numId w:val="1007"/>
+        </w:numPr>
+      </w:pPr>
+      <w:r>
+        <w:t xml:space="preserve">a term that depends on</w:t>
+      </w:r>
+      <w:r>
+        <w:t xml:space="preserve"> </w:t>
+      </w:r>
+      <m:oMath>
+        <m:sSup>
+          <m:e>
+            <m:r>
+              <m:t>σ</m:t>
+            </m:r>
+          </m:e>
+          <m:sup>
+            <m:r>
+              <m:t>2</m:t>
+            </m:r>
+          </m:sup>
+        </m:sSup>
+      </m:oMath>
+      <w:r>
+        <w:t xml:space="preserve"> </w:t>
+      </w:r>
+      <w:r>
+        <w:t xml:space="preserve">but not on</w:t>
+      </w:r>
+      <w:r>
+        <w:t xml:space="preserve"> </w:t>
+      </w:r>
+      <m:oMath>
+        <m:r>
+          <m:t>μ</m:t>
+        </m:r>
+      </m:oMath>
+      <w:r>
+        <w:t xml:space="preserve">;</w:t>
+      </w:r>
+    </w:p>
+    <w:p>
+      <w:pPr>
+        <w:pStyle w:val="Compact"/>
+        <w:numPr>
+          <w:ilvl w:val="0"/>
+          <w:numId w:val="1007"/>
+        </w:numPr>
+      </w:pPr>
+      <w:r>
+        <w:t xml:space="preserve">the sum of squared deviations of the data from</w:t>
+      </w:r>
+      <w:r>
+        <w:t xml:space="preserve"> </w:t>
+      </w:r>
+      <m:oMath>
+        <m:r>
+          <m:t>μ</m:t>
+        </m:r>
+      </m:oMath>
+      <w:r>
+        <w:t xml:space="preserve">,</w:t>
+      </w:r>
+      <w:r>
+        <w:t xml:space="preserve"> </w:t>
+      </w:r>
+      <w:r>
+        <w:t xml:space="preserve">divided by</w:t>
+      </w:r>
+      <w:r>
+        <w:t xml:space="preserve"> </w:t>
+      </w:r>
+      <m:oMath>
+        <m:r>
+          <m:rPr>
+            <m:sty m:val="p"/>
+          </m:rPr>
+          <m:t>−</m:t>
+        </m:r>
+        <m:r>
+          <m:t>2</m:t>
+        </m:r>
+        <m:sSup>
+          <m:e>
+            <m:r>
+              <m:t>σ</m:t>
+            </m:r>
+          </m:e>
+          <m:sup>
+            <m:r>
+              <m:t>2</m:t>
+            </m:r>
+          </m:sup>
+        </m:sSup>
+      </m:oMath>
+      <w:r>
+        <w:t xml:space="preserve">.</w:t>
+      </w:r>
+    </w:p>
+    <w:p>
+      <w:pPr>
+        <w:pStyle w:val="FirstParagraph"/>
+      </w:pPr>
+      <w:r>
+        <w:t xml:space="preserve">The second version gives the reader the formula and where it came from,</w:t>
+      </w:r>
+      <w:r>
+        <w:t xml:space="preserve"> </w:t>
+      </w:r>
+      <w:r>
+        <w:t xml:space="preserve">so they can check the algebra themselves.</w:t>
+      </w:r>
+      <w:r>
+        <w:t xml:space="preserve"> </w:t>
+      </w:r>
+      <w:r>
+        <w:t xml:space="preserve">The first version asks them to take the writer’s word for it,</w:t>
+      </w:r>
+      <w:r>
+        <w:t xml:space="preserve"> </w:t>
+      </w:r>
+      <w:r>
+        <w:t xml:space="preserve">and offers no help to anyone who has not seen the result before.</w:t>
+      </w:r>
+    </w:p>
+    <w:bookmarkEnd w:id="16"/>
+    <w:bookmarkStart w:id="17" w:name="trivial-and-trivially"/>
+    <w:p>
+      <w:pPr>
+        <w:pStyle w:val="Heading3"/>
+      </w:pPr>
+      <w:r>
+        <w:t xml:space="preserve">3.1</w:t>
+      </w:r>
+      <w:r>
+        <w:t xml:space="preserve"> </w:t>
+      </w:r>
+      <w:r>
+        <w:t xml:space="preserve">“Trivial”</w:t>
+      </w:r>
+      <w:r>
+        <w:t xml:space="preserve"> </w:t>
+      </w:r>
+      <w:r>
+        <w:t xml:space="preserve">and</w:t>
+      </w:r>
+      <w:r>
+        <w:t xml:space="preserve"> </w:t>
+      </w:r>
+      <w:r>
+        <w:t xml:space="preserve">“trivially”</w:t>
+      </w:r>
+    </w:p>
+    <w:p>
+      <w:pPr>
+        <w:pStyle w:val="FirstParagraph"/>
+      </w:pPr>
+      <w:r>
+        <w:t xml:space="preserve">“Trivial”</w:t>
+      </w:r>
+      <w:r>
+        <w:t xml:space="preserve"> </w:t>
+      </w:r>
+      <w:r>
+        <w:t xml:space="preserve">and</w:t>
+      </w:r>
+      <w:r>
+        <w:t xml:space="preserve"> </w:t>
+      </w:r>
+      <w:r>
+        <w:t xml:space="preserve">“trivially”</w:t>
+      </w:r>
+      <w:r>
+        <w:t xml:space="preserve"> </w:t>
+      </w:r>
+      <w:r>
+        <w:t xml:space="preserve">usually work the same way:</w:t>
+      </w:r>
+      <w:r>
+        <w:t xml:space="preserve"> </w:t>
+      </w:r>
+      <w:r>
+        <w:t xml:space="preserve">they announce that a step is too small to write down,</w:t>
+      </w:r>
+      <w:r>
+        <w:t xml:space="preserve"> </w:t>
+      </w:r>
+      <w:r>
+        <w:t xml:space="preserve">which relieves the writer of writing it down.</w:t>
+      </w:r>
+      <w:r>
+        <w:t xml:space="preserve"> </w:t>
+      </w:r>
+      <w:r>
+        <w:t xml:space="preserve">Treat them as a prompt to check the step,</w:t>
+      </w:r>
+      <w:r>
+        <w:t xml:space="preserve"> </w:t>
+      </w:r>
+      <w:r>
+        <w:t xml:space="preserve">and to write it out if it takes only a line.</w:t>
+      </w:r>
+    </w:p>
+    <w:p>
+      <w:pPr>
+        <w:pStyle w:val="BodyText"/>
+      </w:pPr>
+      <w:r>
+        <w:t xml:space="preserve">The word has one defensible use,</w:t>
+      </w:r>
+      <w:r>
+        <w:t xml:space="preserve"> </w:t>
+      </w:r>
+      <w:r>
+        <w:t xml:space="preserve">which is describing how a general expression reduces to a simpler one</w:t>
+      </w:r>
+      <w:r>
+        <w:t xml:space="preserve"> </w:t>
+      </w:r>
+      <w:r>
+        <w:t xml:space="preserve">in a special case.</w:t>
+      </w:r>
+      <w:r>
+        <w:t xml:space="preserve"> </w:t>
+      </w:r>
+      <w:r>
+        <w:t xml:space="preserve">For example,</w:t>
+      </w:r>
+      <w:r>
+        <w:t xml:space="preserve"> </w:t>
+      </w:r>
+      <w:r>
+        <w:t xml:space="preserve">a weighted average reduces to an ordinary average</w:t>
+      </w:r>
+      <w:r>
+        <w:t xml:space="preserve"> </w:t>
+      </w:r>
+      <w:r>
+        <w:t xml:space="preserve">when all of the weights are equal.</w:t>
+      </w:r>
+      <w:r>
+        <w:t xml:space="preserve"> </w:t>
+      </w:r>
+      <w:r>
+        <w:t xml:space="preserve">Even in that use,</w:t>
+      </w:r>
+      <w:r>
+        <w:t xml:space="preserve"> </w:t>
+      </w:r>
+      <w:r>
+        <w:t xml:space="preserve">“minimal case”</w:t>
+      </w:r>
+      <w:r>
+        <w:t xml:space="preserve"> </w:t>
+      </w:r>
+      <w:r>
+        <w:t xml:space="preserve">or</w:t>
+      </w:r>
+      <w:r>
+        <w:t xml:space="preserve"> </w:t>
+      </w:r>
+      <w:r>
+        <w:t xml:space="preserve">“degenerate case”</w:t>
+      </w:r>
+      <w:r>
+        <w:t xml:space="preserve"> </w:t>
+      </w:r>
+      <w:r>
+        <w:t xml:space="preserve">names the situation more precisely,</w:t>
+      </w:r>
+      <w:r>
+        <w:t xml:space="preserve"> </w:t>
+      </w:r>
+      <w:r>
+        <w:t xml:space="preserve">and avoids the dismissive tone that</w:t>
+      </w:r>
+      <w:r>
+        <w:t xml:space="preserve"> </w:t>
+      </w:r>
+      <w:r>
+        <w:t xml:space="preserve">“trivial”</w:t>
+      </w:r>
+      <w:r>
+        <w:t xml:space="preserve"> </w:t>
+      </w:r>
+      <w:r>
+        <w:t xml:space="preserve">carries.</w:t>
+      </w:r>
+    </w:p>
+    <w:bookmarkEnd w:id="17"/>
+    <w:bookmarkEnd w:id="18"/>
+    <w:bookmarkStart w:id="19" w:name="what-makes-a-citation-relevant"/>
+    <w:p>
+      <w:pPr>
+        <w:pStyle w:val="Heading2"/>
+      </w:pPr>
+      <w:r>
+        <w:t xml:space="preserve">4 What makes a citation relevant</w:t>
+      </w:r>
+    </w:p>
+    <w:p>
+      <w:pPr>
+        <w:pStyle w:val="FirstParagraph"/>
+      </w:pPr>
+      <w:r>
         <w:t xml:space="preserve">A relevant citation is one that actually supports the specific claim you are making.</w:t>
       </w:r>
       <w:r>
@@ -499,7 +1634,7 @@
         <w:pStyle w:val="Compact"/>
         <w:numPr>
           <w:ilvl w:val="0"/>
-          <w:numId w:val="1005"/>
+          <w:numId w:val="1008"/>
         </w:numPr>
       </w:pPr>
       <w:r>
@@ -518,7 +1653,7 @@
         <w:pStyle w:val="Compact"/>
         <w:numPr>
           <w:ilvl w:val="0"/>
-          <w:numId w:val="1005"/>
+          <w:numId w:val="1008"/>
         </w:numPr>
       </w:pPr>
       <w:r>
@@ -537,7 +1672,7 @@
         <w:pStyle w:val="Compact"/>
         <w:numPr>
           <w:ilvl w:val="0"/>
-          <w:numId w:val="1005"/>
+          <w:numId w:val="1008"/>
         </w:numPr>
       </w:pPr>
       <w:r>
@@ -556,7 +1691,7 @@
         <w:pStyle w:val="Compact"/>
         <w:numPr>
           <w:ilvl w:val="0"/>
-          <w:numId w:val="1005"/>
+          <w:numId w:val="1008"/>
         </w:numPr>
       </w:pPr>
       <w:r>
@@ -583,7 +1718,7 @@
         <w:pStyle w:val="Compact"/>
         <w:numPr>
           <w:ilvl w:val="0"/>
-          <w:numId w:val="1006"/>
+          <w:numId w:val="1009"/>
         </w:numPr>
       </w:pPr>
       <w:r>
@@ -595,7 +1730,7 @@
         <w:pStyle w:val="Compact"/>
         <w:numPr>
           <w:ilvl w:val="0"/>
-          <w:numId w:val="1006"/>
+          <w:numId w:val="1009"/>
         </w:numPr>
       </w:pPr>
       <w:r>
@@ -607,7 +1742,7 @@
         <w:pStyle w:val="Compact"/>
         <w:numPr>
           <w:ilvl w:val="0"/>
-          <w:numId w:val="1006"/>
+          <w:numId w:val="1009"/>
         </w:numPr>
       </w:pPr>
       <w:r>
@@ -619,21 +1754,21 @@
         <w:pStyle w:val="Compact"/>
         <w:numPr>
           <w:ilvl w:val="0"/>
-          <w:numId w:val="1006"/>
+          <w:numId w:val="1009"/>
         </w:numPr>
       </w:pPr>
       <w:r>
         <w:t xml:space="preserve">When citing for general background versus specific claims, make the distinction clear</w:t>
       </w:r>
     </w:p>
-    <w:bookmarkEnd w:id="15"/>
-    <w:bookmarkStart w:id="22" w:name="what-makes-a-source-trustworthy"/>
+    <w:bookmarkEnd w:id="19"/>
+    <w:bookmarkStart w:id="26" w:name="what-makes-a-source-trustworthy"/>
     <w:p>
       <w:pPr>
         <w:pStyle w:val="Heading2"/>
       </w:pPr>
       <w:r>
-        <w:t xml:space="preserve">4 What makes a source trustworthy</w:t>
+        <w:t xml:space="preserve">5 What makes a source trustworthy</w:t>
       </w:r>
     </w:p>
     <w:p>
@@ -650,13 +1785,13 @@
         <w:t xml:space="preserve">Consider these factors when evaluating trustworthiness:</w:t>
       </w:r>
     </w:p>
-    <w:bookmarkStart w:id="16" w:name="peer-review"/>
+    <w:bookmarkStart w:id="20" w:name="peer-review"/>
     <w:p>
       <w:pPr>
         <w:pStyle w:val="Heading3"/>
       </w:pPr>
       <w:r>
-        <w:t xml:space="preserve">4.1 Peer review</w:t>
+        <w:t xml:space="preserve">5.1 Peer review</w:t>
       </w:r>
     </w:p>
     <w:p>
@@ -679,14 +1814,14 @@
         <w:t xml:space="preserve">but it provides a baseline level of quality control.</w:t>
       </w:r>
     </w:p>
-    <w:bookmarkEnd w:id="16"/>
-    <w:bookmarkStart w:id="17" w:name="reputation-of-authors-and-institutions"/>
+    <w:bookmarkEnd w:id="20"/>
+    <w:bookmarkStart w:id="21" w:name="reputation-of-authors-and-institutions"/>
     <w:p>
       <w:pPr>
         <w:pStyle w:val="Heading3"/>
       </w:pPr>
       <w:r>
-        <w:t xml:space="preserve">4.2 Reputation of authors and institutions</w:t>
+        <w:t xml:space="preserve">5.2 Reputation of authors and institutions</w:t>
       </w:r>
     </w:p>
     <w:p>
@@ -703,14 +1838,14 @@
         <w:t xml:space="preserve">though this should not be the sole criterion.</w:t>
       </w:r>
     </w:p>
-    <w:bookmarkEnd w:id="17"/>
-    <w:bookmarkStart w:id="18" w:name="replication-and-consensus"/>
+    <w:bookmarkEnd w:id="21"/>
+    <w:bookmarkStart w:id="22" w:name="replication-and-consensus"/>
     <w:p>
       <w:pPr>
         <w:pStyle w:val="Heading3"/>
       </w:pPr>
       <w:r>
-        <w:t xml:space="preserve">4.3 Replication and consensus</w:t>
+        <w:t xml:space="preserve">5.3 Replication and consensus</w:t>
       </w:r>
     </w:p>
     <w:p>
@@ -733,14 +1868,14 @@
         <w:t xml:space="preserve">are more trustworthy than isolated claims.</w:t>
       </w:r>
     </w:p>
-    <w:bookmarkEnd w:id="18"/>
-    <w:bookmarkStart w:id="19" w:name="transparency-and-reproducibility"/>
+    <w:bookmarkEnd w:id="22"/>
+    <w:bookmarkStart w:id="23" w:name="transparency-and-reproducibility"/>
     <w:p>
       <w:pPr>
         <w:pStyle w:val="Heading3"/>
       </w:pPr>
       <w:r>
-        <w:t xml:space="preserve">4.4 Transparency and reproducibility</w:t>
+        <w:t xml:space="preserve">5.4 Transparency and reproducibility</w:t>
       </w:r>
     </w:p>
     <w:p>
@@ -756,7 +1891,7 @@
         <w:pStyle w:val="Compact"/>
         <w:numPr>
           <w:ilvl w:val="0"/>
-          <w:numId w:val="1007"/>
+          <w:numId w:val="1010"/>
         </w:numPr>
       </w:pPr>
       <w:r>
@@ -768,7 +1903,7 @@
         <w:pStyle w:val="Compact"/>
         <w:numPr>
           <w:ilvl w:val="0"/>
-          <w:numId w:val="1007"/>
+          <w:numId w:val="1010"/>
         </w:numPr>
       </w:pPr>
       <w:r>
@@ -780,7 +1915,7 @@
         <w:pStyle w:val="Compact"/>
         <w:numPr>
           <w:ilvl w:val="0"/>
-          <w:numId w:val="1007"/>
+          <w:numId w:val="1010"/>
         </w:numPr>
       </w:pPr>
       <w:r>
@@ -792,7 +1927,7 @@
         <w:pStyle w:val="Compact"/>
         <w:numPr>
           <w:ilvl w:val="0"/>
-          <w:numId w:val="1007"/>
+          <w:numId w:val="1010"/>
         </w:numPr>
       </w:pPr>
       <w:r>
@@ -807,14 +1942,14 @@
         <w:t xml:space="preserve">are more trustworthy than those lacking these features.</w:t>
       </w:r>
     </w:p>
-    <w:bookmarkEnd w:id="19"/>
-    <w:bookmarkStart w:id="20" w:name="preprints-and-non-peer-reviewed-sources"/>
+    <w:bookmarkEnd w:id="23"/>
+    <w:bookmarkStart w:id="24" w:name="preprints-and-non-peer-reviewed-sources"/>
     <w:p>
       <w:pPr>
         <w:pStyle w:val="Heading3"/>
       </w:pPr>
       <w:r>
-        <w:t xml:space="preserve">4.5 Preprints and non-peer-reviewed sources</w:t>
+        <w:t xml:space="preserve">5.5 Preprints and non-peer-reviewed sources</w:t>
       </w:r>
     </w:p>
     <w:p>
@@ -842,7 +1977,7 @@
         <w:pStyle w:val="Compact"/>
         <w:numPr>
           <w:ilvl w:val="0"/>
-          <w:numId w:val="1008"/>
+          <w:numId w:val="1011"/>
         </w:numPr>
       </w:pPr>
       <w:r>
@@ -854,7 +1989,7 @@
         <w:pStyle w:val="Compact"/>
         <w:numPr>
           <w:ilvl w:val="0"/>
-          <w:numId w:val="1008"/>
+          <w:numId w:val="1011"/>
         </w:numPr>
       </w:pPr>
       <w:r>
@@ -866,21 +2001,21 @@
         <w:pStyle w:val="Compact"/>
         <w:numPr>
           <w:ilvl w:val="0"/>
-          <w:numId w:val="1008"/>
+          <w:numId w:val="1011"/>
         </w:numPr>
       </w:pPr>
       <w:r>
         <w:t xml:space="preserve">Exercise extra scrutiny of the methods and conclusions</w:t>
       </w:r>
     </w:p>
-    <w:bookmarkEnd w:id="20"/>
-    <w:bookmarkStart w:id="21" w:name="sources-to-generally-avoid"/>
+    <w:bookmarkEnd w:id="24"/>
+    <w:bookmarkStart w:id="25" w:name="sources-to-generally-avoid"/>
     <w:p>
       <w:pPr>
         <w:pStyle w:val="Heading3"/>
       </w:pPr>
       <w:r>
-        <w:t xml:space="preserve">4.6 Sources to generally avoid</w:t>
+        <w:t xml:space="preserve">5.6 Sources to generally avoid</w:t>
       </w:r>
     </w:p>
     <w:p>
@@ -896,7 +2031,7 @@
         <w:pStyle w:val="Compact"/>
         <w:numPr>
           <w:ilvl w:val="0"/>
-          <w:numId w:val="1009"/>
+          <w:numId w:val="1012"/>
         </w:numPr>
       </w:pPr>
       <w:r>
@@ -908,7 +2043,7 @@
         <w:pStyle w:val="Compact"/>
         <w:numPr>
           <w:ilvl w:val="0"/>
-          <w:numId w:val="1009"/>
+          <w:numId w:val="1012"/>
         </w:numPr>
       </w:pPr>
       <w:r>
@@ -920,7 +2055,7 @@
         <w:pStyle w:val="Compact"/>
         <w:numPr>
           <w:ilvl w:val="0"/>
-          <w:numId w:val="1009"/>
+          <w:numId w:val="1012"/>
         </w:numPr>
       </w:pPr>
       <w:r>
@@ -932,7 +2067,7 @@
         <w:pStyle w:val="Compact"/>
         <w:numPr>
           <w:ilvl w:val="0"/>
-          <w:numId w:val="1009"/>
+          <w:numId w:val="1012"/>
         </w:numPr>
       </w:pPr>
       <w:r>
@@ -944,22 +2079,22 @@
         <w:pStyle w:val="Compact"/>
         <w:numPr>
           <w:ilvl w:val="0"/>
-          <w:numId w:val="1009"/>
+          <w:numId w:val="1012"/>
         </w:numPr>
       </w:pPr>
       <w:r>
         <w:t xml:space="preserve">Retracted papers</w:t>
       </w:r>
     </w:p>
-    <w:bookmarkEnd w:id="21"/>
-    <w:bookmarkEnd w:id="22"/>
-    <w:bookmarkStart w:id="23" w:name="copy-paste-with-caution"/>
+    <w:bookmarkEnd w:id="25"/>
+    <w:bookmarkEnd w:id="26"/>
+    <w:bookmarkStart w:id="27" w:name="copy-paste-with-caution"/>
     <w:p>
       <w:pPr>
         <w:pStyle w:val="Heading2"/>
       </w:pPr>
       <w:r>
-        <w:t xml:space="preserve">5 Copy-paste with caution</w:t>
+        <w:t xml:space="preserve">6 Copy-paste with caution</w:t>
       </w:r>
     </w:p>
     <w:p>
@@ -1013,7 +2148,7 @@
         <w:pStyle w:val="Compact"/>
         <w:numPr>
           <w:ilvl w:val="0"/>
-          <w:numId w:val="1010"/>
+          <w:numId w:val="1013"/>
         </w:numPr>
       </w:pPr>
       <w:r>
@@ -1047,7 +2182,7 @@
         <w:pStyle w:val="Compact"/>
         <w:numPr>
           <w:ilvl w:val="0"/>
-          <w:numId w:val="1010"/>
+          <w:numId w:val="1013"/>
         </w:numPr>
       </w:pPr>
       <w:r>
@@ -1081,7 +2216,7 @@
         <w:pStyle w:val="Compact"/>
         <w:numPr>
           <w:ilvl w:val="0"/>
-          <w:numId w:val="1010"/>
+          <w:numId w:val="1013"/>
         </w:numPr>
       </w:pPr>
       <w:r>
@@ -1152,14 +2287,14 @@
         <w:t xml:space="preserve">this keeps a single source of truth and improves concision.</w:t>
       </w:r>
     </w:p>
-    <w:bookmarkEnd w:id="23"/>
-    <w:bookmarkStart w:id="24" w:name="best-practices"/>
+    <w:bookmarkEnd w:id="27"/>
+    <w:bookmarkStart w:id="28" w:name="best-practices"/>
     <w:p>
       <w:pPr>
         <w:pStyle w:val="Heading2"/>
       </w:pPr>
       <w:r>
-        <w:t xml:space="preserve">6 Best practices</w:t>
+        <w:t xml:space="preserve">7 Best practices</w:t>
       </w:r>
     </w:p>
     <w:p>
@@ -1175,7 +2310,7 @@
         <w:pStyle w:val="Compact"/>
         <w:numPr>
           <w:ilvl w:val="0"/>
-          <w:numId w:val="1011"/>
+          <w:numId w:val="1014"/>
         </w:numPr>
       </w:pPr>
       <w:r>
@@ -1200,7 +2335,7 @@
         <w:pStyle w:val="Compact"/>
         <w:numPr>
           <w:ilvl w:val="0"/>
-          <w:numId w:val="1011"/>
+          <w:numId w:val="1014"/>
         </w:numPr>
       </w:pPr>
       <w:r>
@@ -1219,7 +2354,7 @@
         <w:pStyle w:val="Compact"/>
         <w:numPr>
           <w:ilvl w:val="0"/>
-          <w:numId w:val="1011"/>
+          <w:numId w:val="1014"/>
         </w:numPr>
       </w:pPr>
       <w:r>
@@ -1238,7 +2373,7 @@
         <w:pStyle w:val="Compact"/>
         <w:numPr>
           <w:ilvl w:val="0"/>
-          <w:numId w:val="1011"/>
+          <w:numId w:val="1014"/>
         </w:numPr>
       </w:pPr>
       <w:r>
@@ -1278,7 +2413,7 @@
         <w:pStyle w:val="Compact"/>
         <w:numPr>
           <w:ilvl w:val="0"/>
-          <w:numId w:val="1011"/>
+          <w:numId w:val="1014"/>
         </w:numPr>
       </w:pPr>
       <w:r>
@@ -1297,7 +2432,7 @@
         <w:pStyle w:val="Compact"/>
         <w:numPr>
           <w:ilvl w:val="0"/>
-          <w:numId w:val="1011"/>
+          <w:numId w:val="1014"/>
         </w:numPr>
       </w:pPr>
       <w:r>
@@ -1316,7 +2451,7 @@
         <w:pStyle w:val="Compact"/>
         <w:numPr>
           <w:ilvl w:val="0"/>
-          <w:numId w:val="1011"/>
+          <w:numId w:val="1014"/>
         </w:numPr>
       </w:pPr>
       <w:r>
@@ -1330,22 +2465,22 @@
         <w:t xml:space="preserve">: When possible, include work from different research groups and perspectives</w:t>
       </w:r>
     </w:p>
-    <w:bookmarkEnd w:id="24"/>
-    <w:bookmarkStart w:id="25" w:name="common-citation-errors-to-avoid"/>
+    <w:bookmarkEnd w:id="28"/>
+    <w:bookmarkStart w:id="29" w:name="common-citation-errors-to-avoid"/>
     <w:p>
       <w:pPr>
         <w:pStyle w:val="Heading2"/>
       </w:pPr>
       <w:r>
-        <w:t xml:space="preserve">7 Common citation errors to avoid</w:t>
-      </w:r>
-    </w:p>
-    <w:p>
-      <w:pPr>
-        <w:pStyle w:val="Compact"/>
-        <w:numPr>
-          <w:ilvl w:val="0"/>
-          <w:numId w:val="1012"/>
+        <w:t xml:space="preserve">8 Common citation errors to avoid</w:t>
+      </w:r>
+    </w:p>
+    <w:p>
+      <w:pPr>
+        <w:pStyle w:val="Compact"/>
+        <w:numPr>
+          <w:ilvl w:val="0"/>
+          <w:numId w:val="1015"/>
         </w:numPr>
       </w:pPr>
       <w:r>
@@ -1364,7 +2499,7 @@
         <w:pStyle w:val="Compact"/>
         <w:numPr>
           <w:ilvl w:val="0"/>
-          <w:numId w:val="1012"/>
+          <w:numId w:val="1015"/>
         </w:numPr>
       </w:pPr>
       <w:r>
@@ -1389,16 +2524,62 @@
       <w:r>
         <w:t xml:space="preserve">without citing specific studies</w:t>
       </w:r>
-      <w:r>
-        <w:br/>
-      </w:r>
-    </w:p>
-    <w:p>
-      <w:pPr>
-        <w:pStyle w:val="Compact"/>
-        <w:numPr>
-          <w:ilvl w:val="0"/>
-          <w:numId w:val="1012"/>
+    </w:p>
+    <w:p>
+      <w:pPr>
+        <w:pStyle w:val="Compact"/>
+        <w:numPr>
+          <w:ilvl w:val="0"/>
+          <w:numId w:val="1015"/>
+        </w:numPr>
+      </w:pPr>
+      <w:r>
+        <w:rPr>
+          <w:b/>
+          <w:bCs/>
+        </w:rPr>
+        <w:t xml:space="preserve">Appeal to obviousness</w:t>
+      </w:r>
+      <w:r>
+        <w:t xml:space="preserve">: Using</w:t>
+      </w:r>
+      <w:r>
+        <w:t xml:space="preserve"> </w:t>
+      </w:r>
+      <w:r>
+        <w:t xml:space="preserve">“obviously”</w:t>
+      </w:r>
+      <w:r>
+        <w:t xml:space="preserve">,</w:t>
+      </w:r>
+      <w:r>
+        <w:t xml:space="preserve"> </w:t>
+      </w:r>
+      <w:r>
+        <w:t xml:space="preserve">“clearly”</w:t>
+      </w:r>
+      <w:r>
+        <w:t xml:space="preserve">, or</w:t>
+      </w:r>
+      <w:r>
+        <w:t xml:space="preserve"> </w:t>
+      </w:r>
+      <w:r>
+        <w:t xml:space="preserve">“as everyone knows”</w:t>
+      </w:r>
+      <w:r>
+        <w:t xml:space="preserve"> </w:t>
+      </w:r>
+      <w:r>
+        <w:t xml:space="preserve">in place of a derivation or a citation</w:t>
+      </w:r>
+    </w:p>
+    <w:p>
+      <w:pPr>
+        <w:pStyle w:val="Compact"/>
+        <w:numPr>
+          <w:ilvl w:val="0"/>
+          <w:numId w:val="1015"/>
         </w:numPr>
       </w:pPr>
       <w:r>
@@ -1417,7 +2598,7 @@
         <w:pStyle w:val="Compact"/>
         <w:numPr>
           <w:ilvl w:val="0"/>
-          <w:numId w:val="1012"/>
+          <w:numId w:val="1015"/>
         </w:numPr>
       </w:pPr>
       <w:r>
@@ -1436,7 +2617,7 @@
         <w:pStyle w:val="Compact"/>
         <w:numPr>
           <w:ilvl w:val="0"/>
-          <w:numId w:val="1012"/>
+          <w:numId w:val="1015"/>
         </w:numPr>
       </w:pPr>
       <w:r>
@@ -1455,7 +2636,7 @@
         <w:pStyle w:val="Compact"/>
         <w:numPr>
           <w:ilvl w:val="0"/>
-          <w:numId w:val="1012"/>
+          <w:numId w:val="1015"/>
         </w:numPr>
       </w:pPr>
       <w:r>
@@ -1469,23 +2650,23 @@
         <w:t xml:space="preserve">: Failing to cite work that directly influenced your ideas</w:t>
       </w:r>
     </w:p>
-    <w:bookmarkEnd w:id="25"/>
-    <w:bookmarkStart w:id="31" w:name="examples"/>
+    <w:bookmarkEnd w:id="29"/>
+    <w:bookmarkStart w:id="35" w:name="examples"/>
     <w:p>
       <w:pPr>
         <w:pStyle w:val="Heading2"/>
       </w:pPr>
       <w:r>
-        <w:t xml:space="preserve">8 Examples</w:t>
-      </w:r>
-    </w:p>
-    <w:bookmarkStart w:id="26" w:name="poor-unsupported-claim"/>
+        <w:t xml:space="preserve">9 Examples</w:t>
+      </w:r>
+    </w:p>
+    <w:bookmarkStart w:id="30" w:name="poor-unsupported-claim"/>
     <w:p>
       <w:pPr>
         <w:pStyle w:val="Heading3"/>
       </w:pPr>
       <w:r>
-        <w:t xml:space="preserve">8.1 Poor (unsupported claim)</w:t>
+        <w:t xml:space="preserve">9.1 Poor (unsupported claim)</w:t>
       </w:r>
     </w:p>
     <w:p>
@@ -1511,14 +2692,14 @@
         <w:t xml:space="preserve">: This claim is stated as fact without any support.</w:t>
       </w:r>
     </w:p>
-    <w:bookmarkEnd w:id="26"/>
-    <w:bookmarkStart w:id="27" w:name="better-citation-provided"/>
+    <w:bookmarkEnd w:id="30"/>
+    <w:bookmarkStart w:id="31" w:name="better-citation-provided"/>
     <w:p>
       <w:pPr>
         <w:pStyle w:val="Heading3"/>
       </w:pPr>
       <w:r>
-        <w:t xml:space="preserve">8.2 Better (citation provided)</w:t>
+        <w:t xml:space="preserve">9.2 Better (citation provided)</w:t>
       </w:r>
     </w:p>
     <w:p>
@@ -1553,14 +2734,14 @@
         <w:t xml:space="preserve">: Citations provide evidence for the claim.</w:t>
       </w:r>
     </w:p>
-    <w:bookmarkEnd w:id="27"/>
-    <w:bookmarkStart w:id="28" w:name="best-citation-with-context"/>
+    <w:bookmarkEnd w:id="31"/>
+    <w:bookmarkStart w:id="32" w:name="best-citation-with-context"/>
     <w:p>
       <w:pPr>
         <w:pStyle w:val="Heading3"/>
       </w:pPr>
       <w:r>
-        <w:t xml:space="preserve">8.3 Best (citation with context)</w:t>
+        <w:t xml:space="preserve">9.3 Best (citation with context)</w:t>
       </w:r>
     </w:p>
     <w:p>
@@ -1607,14 +2788,14 @@
         <w:t xml:space="preserve">: The specific support each citation provides is explained.</w:t>
       </w:r>
     </w:p>
-    <w:bookmarkEnd w:id="28"/>
-    <w:bookmarkStart w:id="29" w:name="poor-irrelevant-citation"/>
+    <w:bookmarkEnd w:id="32"/>
+    <w:bookmarkStart w:id="33" w:name="poor-irrelevant-citation"/>
     <w:p>
       <w:pPr>
         <w:pStyle w:val="Heading3"/>
       </w:pPr>
       <w:r>
-        <w:t xml:space="preserve">8.4 Poor (irrelevant citation)</w:t>
+        <w:t xml:space="preserve">9.4 Poor (irrelevant citation)</w:t>
       </w:r>
     </w:p>
     <w:p>
@@ -1649,14 +2830,14 @@
         <w:t xml:space="preserve">: Knuth’s 1984 paper on literate programming doesn’t address Python or data science.</w:t>
       </w:r>
     </w:p>
-    <w:bookmarkEnd w:id="29"/>
-    <w:bookmarkStart w:id="30" w:name="better-relevant-citation"/>
+    <w:bookmarkEnd w:id="33"/>
+    <w:bookmarkStart w:id="34" w:name="better-relevant-citation"/>
     <w:p>
       <w:pPr>
         <w:pStyle w:val="Heading3"/>
       </w:pPr>
       <w:r>
-        <w:t xml:space="preserve">8.5 Better (relevant citation)</w:t>
+        <w:t xml:space="preserve">9.5 Better (relevant citation)</w:t>
       </w:r>
     </w:p>
     <w:p>
@@ -1691,15 +2872,15 @@
         <w:t xml:space="preserve">: The citation is to a current survey of programming language usage.</w:t>
       </w:r>
     </w:p>
-    <w:bookmarkEnd w:id="30"/>
-    <w:bookmarkEnd w:id="31"/>
-    <w:bookmarkStart w:id="41" w:name="conclusion"/>
+    <w:bookmarkEnd w:id="34"/>
+    <w:bookmarkEnd w:id="35"/>
+    <w:bookmarkStart w:id="45" w:name="conclusion"/>
     <w:p>
       <w:pPr>
         <w:pStyle w:val="Heading2"/>
       </w:pPr>
       <w:r>
-        <w:t xml:space="preserve">9 Conclusion</w:t>
+        <w:t xml:space="preserve">10 Conclusion</w:t>
       </w:r>
     </w:p>
     <w:p>
@@ -1743,7 +2924,7 @@
         <w:t xml:space="preserve"> </w:t>
       </w:r>
       <w:r>
-        <w:t xml:space="preserve">If the answer isn’t obvious from your text,</w:t>
+        <w:t xml:space="preserve">If your text does not answer that question,</w:t>
       </w:r>
       <w:r>
         <w:t xml:space="preserve"> </w:t>
@@ -1752,8 +2933,8 @@
         <w:t xml:space="preserve">add a citation or present direct evidence.</w:t>
       </w:r>
     </w:p>
-    <w:bookmarkStart w:id="40" w:name="refs"/>
-    <w:bookmarkStart w:id="33" w:name="ref-hawkins2004"/>
+    <w:bookmarkStart w:id="44" w:name="refs"/>
+    <w:bookmarkStart w:id="37" w:name="ref-hawkins2004"/>
     <w:p>
       <w:pPr>
         <w:pStyle w:val="Bibliography"/>
@@ -1786,7 +2967,7 @@
       <w:r>
         <w:t xml:space="preserve"> </w:t>
       </w:r>
-      <w:hyperlink r:id="rId32">
+      <w:hyperlink r:id="rId36">
         <w:r>
           <w:rPr>
             <w:rStyle w:val="Hyperlink"/>
@@ -1798,8 +2979,8 @@
         <w:t xml:space="preserve">.</w:t>
       </w:r>
     </w:p>
-    <w:bookmarkEnd w:id="33"/>
-    <w:bookmarkStart w:id="35" w:name="ref-knuth84"/>
+    <w:bookmarkEnd w:id="37"/>
+    <w:bookmarkStart w:id="39" w:name="ref-knuth84"/>
     <w:p>
       <w:pPr>
         <w:pStyle w:val="Bibliography"/>
@@ -1832,7 +3013,7 @@
       <w:r>
         <w:t xml:space="preserve"> </w:t>
       </w:r>
-      <w:hyperlink r:id="rId34">
+      <w:hyperlink r:id="rId38">
         <w:r>
           <w:rPr>
             <w:rStyle w:val="Hyperlink"/>
@@ -1844,8 +3025,8 @@
         <w:t xml:space="preserve">.</w:t>
       </w:r>
     </w:p>
-    <w:bookmarkEnd w:id="35"/>
-    <w:bookmarkStart w:id="37" w:name="ref-stackoverflow2024"/>
+    <w:bookmarkEnd w:id="39"/>
+    <w:bookmarkStart w:id="41" w:name="ref-stackoverflow2024"/>
     <w:p>
       <w:pPr>
         <w:pStyle w:val="Bibliography"/>
@@ -1869,7 +3050,7 @@
       <w:r>
         <w:t xml:space="preserve"> </w:t>
       </w:r>
-      <w:hyperlink r:id="rId36">
+      <w:hyperlink r:id="rId40">
         <w:r>
           <w:rPr>
             <w:rStyle w:val="Hyperlink"/>
@@ -1881,8 +3062,8 @@
         <w:t xml:space="preserve">.</w:t>
       </w:r>
     </w:p>
-    <w:bookmarkEnd w:id="37"/>
-    <w:bookmarkStart w:id="39" w:name="ref-vapnik1998"/>
+    <w:bookmarkEnd w:id="41"/>
+    <w:bookmarkStart w:id="43" w:name="ref-vapnik1998"/>
     <w:p>
       <w:pPr>
         <w:pStyle w:val="Bibliography"/>
@@ -1906,7 +3087,7 @@
       <w:r>
         <w:t xml:space="preserve"> </w:t>
       </w:r>
-      <w:hyperlink r:id="rId38">
+      <w:hyperlink r:id="rId42">
         <w:r>
           <w:rPr>
             <w:rStyle w:val="Hyperlink"/>
@@ -1918,9 +3099,9 @@
         <w:t xml:space="preserve">.</w:t>
       </w:r>
     </w:p>
-    <w:bookmarkEnd w:id="39"/>
-    <w:bookmarkEnd w:id="40"/>
-    <w:bookmarkEnd w:id="41"/>
+    <w:bookmarkEnd w:id="43"/>
+    <w:bookmarkEnd w:id="44"/>
+    <w:bookmarkEnd w:id="45"/>
     <w:sectPr>
       <w:footnotePr>
         <w:numRestart w:val="eachSect"/>
@@ -2253,6 +3434,15 @@
     <w:abstractNumId w:val="991"/>
   </w:num>
   <w:num w:numId="1011">
+    <w:abstractNumId w:val="991"/>
+  </w:num>
+  <w:num w:numId="1012">
+    <w:abstractNumId w:val="991"/>
+  </w:num>
+  <w:num w:numId="1013">
+    <w:abstractNumId w:val="991"/>
+  </w:num>
+  <w:num w:numId="1014">
     <w:abstractNumId w:val="99411"/>
     <w:lvlOverride w:ilvl="0">
       <w:startOverride w:val="1"/>
@@ -2282,7 +3472,7 @@
       <w:startOverride w:val="1"/>
     </w:lvlOverride>
   </w:num>
-  <w:num w:numId="1012">
+  <w:num w:numId="1015">
     <w:abstractNumId w:val="991"/>
   </w:num>
 </w:numbering>

</xml_diff>